<commit_message>
feat: indice automatico en el perfil lbtssi
El salto de pagina lo hace el propio titulo del indice con pageBreakBefore, no
un parrafo suelto con un salto: la portada de esta materia es larga y con el
parrafo suelto quedaba una hoja en blanco entre la portada y el indice.

Co-Authored-By: Claude Opus 5 (1M context) <noreply@anthropic.com>
Claude-Session: https://claude.ai/code/session_01KCnPzXUmFWcwoaxfqgXXif
</commit_message>
<xml_diff>
--- a/plantillas/portada-lbtssi.docx
+++ b/plantillas/portada-lbtssi.docx
@@ -592,6 +592,67 @@
           <w:rFonts w:eastAsia="Arial" w:cs="Arial"/>
         </w:rPr>
         <w:t>{{FECHA}}</w:t>
+      </w:r>
+    </w:p>
+    <w:p>
+      <w:pPr>
+        <w:pageBreakBefore/>
+        <w:spacing w:before="480" w:after="240"/>
+        <w:rPr>
+          <w:rFonts w:eastAsia="Arial" w:cs="Arial"/>
+          <w:b/>
+          <w:sz w:val="32"/>
+        </w:rPr>
+      </w:pPr>
+      <w:r>
+        <w:rPr>
+          <w:rFonts w:eastAsia="Arial" w:cs="Arial"/>
+          <w:b/>
+          <w:sz w:val="32"/>
+        </w:rPr>
+        <w:lastRenderedPageBreak/>
+        <w:t>Índice</w:t>
+      </w:r>
+    </w:p>
+    <w:p>
+      <w:pPr>
+        <w:spacing w:before="240" w:after="240"/>
+        <w:rPr>
+          <w:rFonts w:eastAsia="Arial" w:cs="Arial"/>
+        </w:rPr>
+      </w:pPr>
+      <w:r>
+        <w:rPr>
+          <w:rFonts w:eastAsia="Arial" w:cs="Arial"/>
+        </w:rPr>
+        <w:fldChar w:fldCharType="begin"/>
+      </w:r>
+      <w:r>
+        <w:rPr>
+          <w:rFonts w:eastAsia="Arial" w:cs="Arial"/>
+        </w:rPr>
+        <w:instrText xml:space="preserve"> TOC \o "1-3" \h \z \u </w:instrText>
+      </w:r>
+      <w:r>
+        <w:rPr>
+          <w:rFonts w:eastAsia="Arial" w:cs="Arial"/>
+        </w:rPr>
+        <w:fldChar w:fldCharType="separate"/>
+      </w:r>
+      <w:r>
+        <w:rPr>
+          <w:rFonts w:eastAsia="Arial" w:cs="Arial"/>
+          <w:b/>
+          <w:bCs/>
+          <w:noProof/>
+        </w:rPr>
+        <w:t>No se encontraron entradas de tabla de contenido.</w:t>
+      </w:r>
+      <w:r>
+        <w:rPr>
+          <w:rFonts w:eastAsia="Arial" w:cs="Arial"/>
+        </w:rPr>
+        <w:fldChar w:fldCharType="end"/>
       </w:r>
     </w:p>
     <w:sectPr>

</xml_diff>